<commit_message>
Final note: reference Figure 2 boxes, remove repeated sentence
Co-Authored-By: Claude Opus 5.5 <noreply@anthropic.com>
Claude-Session: https://claude.ai/code/session_01Xu2Epx64Wygh8wfGcyNeKH
</commit_message>
<xml_diff>
--- a/Mid-term note - Greggs/My_Greggs_Note_FINAL.docx
+++ b/Mid-term note - Greggs/My_Greggs_Note_FINAL.docx
@@ -122,7 +122,7 @@
         <w:jc w:val="both"/>
       </w:pPr>
       <w:r>
-        <w:t>Greggs gives customers cheap food in shops that are close by and reliable (value creation). However, each shop does not bake based on customer demand; it relies on its own guesses, which leads to leftover food (value configuration). Greggs makes money by selling lots of cheap items to lots of people (value capture) (Greggs plc, 2026).</w:t>
+        <w:t>Greggs gives customers cheap food in shops that are close by and reliable (value creation, C1 in Figure 2). However, each shop does not bake based on customer demand; it relies on its own guesses, which leads to leftover food (value configuration, C2). Greggs makes money by selling lots of cheap items to lots of people (value capture, C3) (Greggs plc, 2026).</w:t>
       </w:r>
     </w:p>
     <w:p>
@@ -251,7 +251,7 @@
         <w:jc w:val="both"/>
       </w:pPr>
       <w:r>
-        <w:t>Using the information from everyday orders on the app, Greggs can predict what to bake, which will also help it plan how many staff it needs. This means less leftover food, which could instead be sold for a profit. If more people ordered through the Greggs app instead of Uber Eats, Greggs would keep more of the money.</w:t>
+        <w:t>Using the information from everyday orders on the app, Greggs can predict what to bake (P2), which will also help it plan how many staff it needs. This means less leftover food, which could instead be sold for a profit.</w:t>
       </w:r>
     </w:p>
     <w:p>
@@ -259,7 +259,7 @@
         <w:jc w:val="both"/>
       </w:pPr>
       <w:r>
-        <w:t>With this plan, customers would find their favourite items sold out less often, and they could skip the queue by ordering ahead in the app (new value creation). This matters to me: once at lunchtime, the item I wanted was sold out, so I left and went to Subway, and Greggs lost that sale. With the new plan, Greggs would throw away less food and would not pay Uber Eats a cut on orders made in its own app (new value capture). Figure 2 compares the current business model with the new one.</w:t>
+        <w:t>With this plan, customers would find their favourite items sold out less often, and they could skip the queue by ordering ahead in the app (new value creation, P1). This matters to me: once at lunchtime, the item I wanted was sold out, so I left and went to Subway, and Greggs lost that sale. With the new plan, Greggs would throw away less food and would not pay Uber Eats a cut on orders made in its own app (new value capture, P3). Figure 2 compares the current business model with the new one.</w:t>
       </w:r>
     </w:p>
     <w:p>
@@ -518,7 +518,7 @@
         <w:rPr>
           <w:b/>
         </w:rPr>
-        <w:t>Word count: 1292 words (excluding headings, figures, captions and reference list)</w:t>
+        <w:t>Word count: 1282 words (excluding headings, figures, captions and reference list)</w:t>
       </w:r>
     </w:p>
     <w:p>

</xml_diff>

<commit_message>
Final note: add agility level and critical point on forecast errors
Co-Authored-By: Claude Opus 5.5 <noreply@anthropic.com>
Claude-Session: https://claude.ai/code/session_01Xu2Epx64Wygh8wfGcyNeKH
</commit_message>
<xml_diff>
--- a/Mid-term note - Greggs/My_Greggs_Note_FINAL.docx
+++ b/Mid-term note - Greggs/My_Greggs_Note_FINAL.docx
@@ -416,7 +416,7 @@
         <w:t>Fixing staff resistance:</w:t>
       </w:r>
       <w:r>
-        <w:t xml:space="preserve"> Greggs should train shop managers to use the new system, so they are not confused. The computer should only suggest how much to bake, while the manager still makes the final decision, so staff are not scared of being replaced.</w:t>
+        <w:t xml:space="preserve"> Greggs should train shop managers to use the new system, so they are not confused. The computer should only suggest how much to bake, while the manager still makes the final decision, so staff are not scared of being replaced. This also covers a weakness in my own plan: the AI forecast may get unusual days wrong, such as a sudden storm or a football match, so shops could still run out of food. Because the manager makes the final decision, they can change the bake on those days.</w:t>
       </w:r>
     </w:p>
     <w:p>
@@ -444,7 +444,7 @@
         <w:t>The agile model:</w:t>
       </w:r>
       <w:r>
-        <w:t xml:space="preserve"> Greggs only needs to change the most relevant dimensions of the agile model, not become fully agile like Google (Curchod, 2026b). Three dimensions matter most. </w:t>
+        <w:t xml:space="preserve"> Today, Greggs has a low level of agility, because every shop follows head-office rules. It should aim for a medium level, with agile working only for the app project. Greggs only needs to change the most relevant dimensions of the agile model, not become fully agile like Google (Curchod, 2026b). Three dimensions matter most. </w:t>
       </w:r>
       <w:r>
         <w:rPr>
@@ -518,7 +518,7 @@
         <w:rPr>
           <w:b/>
         </w:rPr>
-        <w:t>Word count: 1282 words (excluding headings, figures, captions and reference list)</w:t>
+        <w:t>Word count: 1360 words (excluding headings, figures, captions and reference list)</w:t>
       </w:r>
     </w:p>
     <w:p>

</xml_diff>

<commit_message>
Final note: trim to about 1,300 words
Co-Authored-By: Claude Opus 5.5 <noreply@anthropic.com>
Claude-Session: https://claude.ai/code/session_01Xu2Epx64Wygh8wfGcyNeKH
</commit_message>
<xml_diff>
--- a/Mid-term note - Greggs/My_Greggs_Note_FINAL.docx
+++ b/Mid-term note - Greggs/My_Greggs_Note_FINAL.docx
@@ -72,7 +72,7 @@
         <w:t>Economic:</w:t>
       </w:r>
       <w:r>
-        <w:t xml:space="preserve"> People have less money, so they buy cheaper things. This means Greggs cannot simply raise its prices to cover higher staff costs (HM Treasury, 2024), because it would lose customers. Near my university, I could also buy cheap food at McDonald's or Subway. People might choose them because of their sandwiches. I still choose Greggs because it is reliable. This shows that customers can easily go somewhere else, so Greggs has to keep its prices low (Porter, 2008).</w:t>
+        <w:t xml:space="preserve"> People have less money, so they buy cheaper things. This means Greggs cannot simply raise its prices to cover higher staff costs (HM Treasury, 2024), because it would lose customers. Near my university, I could also buy cheap food at McDonald's or Subway. I still choose Greggs because it is reliable. This shows that customers can easily go somewhere else, so Greggs has to keep its prices low (Porter, 2008).</w:t>
       </w:r>
     </w:p>
     <w:p>
@@ -86,7 +86,7 @@
         <w:t>Social:</w:t>
       </w:r>
       <w:r>
-        <w:t xml:space="preserve"> When people order through the Greggs app, Greggs keeps more of the money. When they order through delivery apps like Uber Eats, part of the money goes to the app, so Greggs loses out (Greggs plc, 2026). Evening is also Greggs' fastest-growing time of day, at 9.4% of sales in 2025, up from 9.0% the year before (Greggs plc, 2026). Students studying late, like those at my university, and people finishing work or late shifts want cheap food in the evening. This means shops need to bake different food at night, such as pizza instead of breakfast items, which is hard to get right by guessing.</w:t>
+        <w:t xml:space="preserve"> When people order through the Greggs app, Greggs keeps more of the money. When they order through delivery apps like Uber Eats, part of the money goes to the app, so Greggs loses out (Greggs plc, 2026). Evening is also Greggs' fastest-growing time of day, at 9.4% of sales in 2025 (Greggs plc, 2026). Students studying late, like those at my university, and people finishing work or late shifts want cheap food in the evening. This means shops need to bake different food at night, such as pizza instead of breakfast items, which is hard to get right by guessing.</w:t>
       </w:r>
     </w:p>
     <w:p>
@@ -444,7 +444,7 @@
         <w:t>The agile model:</w:t>
       </w:r>
       <w:r>
-        <w:t xml:space="preserve"> Today, Greggs has a low level of agility, because every shop follows head-office rules. It should aim for a medium level, with agile working only for the app project. Greggs only needs to change the most relevant dimensions of the agile model, not become fully agile like Google (Curchod, 2026b). Three dimensions matter most. </w:t>
+        <w:t xml:space="preserve"> Today, Greggs has a low level of agility, because every shop follows head-office rules. It should aim for a medium level, with agile working only for the app project (Curchod, 2026b). </w:t>
       </w:r>
       <w:r>
         <w:rPr>
@@ -507,7 +507,7 @@
         <w:jc w:val="both"/>
       </w:pPr>
       <w:r>
-        <w:t>Greggs should use the information from app orders to decide what each shop bakes. This would mean less food wasted, and Greggs would keep more of its money instead of paying part of it to Uber Eats. To make the change work, Greggs should test it first in a few shops, with staff trained and involved, before using it across all of its shops.</w:t>
+        <w:t>Greggs should use the information from app orders to decide what each shop bakes. This would mean less food wasted, and Greggs would keep more of its money instead of paying part of it to Uber Eats. To make the change work, Greggs should test it first in a few shops, with staff trained and involved.</w:t>
       </w:r>
     </w:p>
     <w:p>
@@ -518,7 +518,7 @@
         <w:rPr>
           <w:b/>
         </w:rPr>
-        <w:t>Word count: 1360 words (excluding headings, figures, captions and reference list)</w:t>
+        <w:t>Word count: 1315 words (excluding headings, figures, captions and reference list)</w:t>
       </w:r>
     </w:p>
     <w:p>

</xml_diff>

<commit_message>
Final note: add Collis (2021) and McKinsey failure statistic
Co-Authored-By: Claude Opus 5.5 <noreply@anthropic.com>
Claude-Session: https://claude.ai/code/session_01Xu2Epx64Wygh8wfGcyNeKH
</commit_message>
<xml_diff>
--- a/Mid-term note - Greggs/My_Greggs_Note_FINAL.docx
+++ b/Mid-term note - Greggs/My_Greggs_Note_FINAL.docx
@@ -259,7 +259,7 @@
         <w:jc w:val="both"/>
       </w:pPr>
       <w:r>
-        <w:t>With this plan, customers would find their favourite items sold out less often, and they could skip the queue by ordering ahead in the app (new value creation, P1). This matters to me: once at lunchtime, the item I wanted was sold out, so I left and went to Subway, and Greggs lost that sale. With the new plan, Greggs would throw away less food and would not pay Uber Eats a cut on orders made in its own app (new value capture, P3). Figure 2 compares the current business model with the new one.</w:t>
+        <w:t>With this plan, customers would find their favourite items sold out less often, and they could skip the queue by ordering ahead in the app (new value creation, P1). This matters to me: once at lunchtime, the item I wanted was sold out, so I left and went to Subway, and Greggs lost that sale. With the new plan, Greggs would throw away less food and would not pay Uber Eats a cut on orders made in its own app (new value capture, P3). This links value creation to value capture, as a strategy should (Collis, 2021). Figure 2 compares the current business model with the new one.</w:t>
       </w:r>
     </w:p>
     <w:p>
@@ -347,6 +347,14 @@
           <w:sz w:val="26"/>
         </w:rPr>
         <w:t>4. Challenges</w:t>
+      </w:r>
+    </w:p>
+    <w:p>
+      <w:pPr>
+        <w:jc w:val="both"/>
+      </w:pPr>
+      <w:r>
+        <w:t>About 70% of digital transformations fail to meet their goals (McKinsey, 2025, cited in Curchod, 2026d), so these challenges matter.</w:t>
       </w:r>
     </w:p>
     <w:p>
@@ -518,7 +526,7 @@
         <w:rPr>
           <w:b/>
         </w:rPr>
-        <w:t>Word count: 1315 words (excluding headings, figures, captions and reference list)</w:t>
+        <w:t>Word count: 1348 words (excluding headings, figures, captions and reference list)</w:t>
       </w:r>
     </w:p>
     <w:p>
@@ -533,6 +541,31 @@
           <w:sz w:val="26"/>
         </w:rPr>
         <w:t>Reference list</w:t>
+      </w:r>
+    </w:p>
+    <w:p>
+      <w:pPr>
+        <w:spacing w:after="80"/>
+        <w:ind w:left="567" w:hanging="567"/>
+      </w:pPr>
+      <w:r>
+        <w:rPr>
+          <w:sz w:val="20"/>
+        </w:rPr>
+        <w:t xml:space="preserve">Collis, D. (2021) 'Why do so many strategies fail?', </w:t>
+      </w:r>
+      <w:r>
+        <w:rPr>
+          <w:i/>
+          <w:sz w:val="20"/>
+        </w:rPr>
+        <w:t>Harvard Business Review</w:t>
+      </w:r>
+      <w:r>
+        <w:rPr>
+          <w:sz w:val="20"/>
+        </w:rPr>
+        <w:t>, 99(4). Available at: https://hbr.org/2021/07/why-do-so-many-strategies-fail (Accessed: 30 October 2026).</w:t>
       </w:r>
     </w:p>
     <w:p>
@@ -595,6 +628,31 @@
           <w:sz w:val="20"/>
         </w:rPr>
         <w:t xml:space="preserve">Curchod, C. (2026c) 'Beware national cultures: an exploration of the East vs. West digital ecosystems' [Lecture slides], </w:t>
+      </w:r>
+      <w:r>
+        <w:rPr>
+          <w:i/>
+          <w:sz w:val="20"/>
+        </w:rPr>
+        <w:t>The Strategy of Digital Transformation</w:t>
+      </w:r>
+      <w:r>
+        <w:rPr>
+          <w:sz w:val="20"/>
+        </w:rPr>
+        <w:t>. University of Edinburgh Business School. Available at: Learn (Accessed: 30 October 2026).</w:t>
+      </w:r>
+    </w:p>
+    <w:p>
+      <w:pPr>
+        <w:spacing w:after="80"/>
+        <w:ind w:left="567" w:hanging="567"/>
+      </w:pPr>
+      <w:r>
+        <w:rPr>
+          <w:sz w:val="20"/>
+        </w:rPr>
+        <w:t xml:space="preserve">Curchod, C. (2026d) 'Strategy starts with value opportunities: macro, industry and firm-level analysis in the digital age' [Lecture slides], </w:t>
       </w:r>
       <w:r>
         <w:rPr>

</xml_diff>

<commit_message>
Final note: use agile maturity levels from Week 4 reading
Co-Authored-By: Claude Opus 5.5 <noreply@anthropic.com>
Claude-Session: https://claude.ai/code/session_01Xu2Epx64Wygh8wfGcyNeKH
</commit_message>
<xml_diff>
--- a/Mid-term note - Greggs/My_Greggs_Note_FINAL.docx
+++ b/Mid-term note - Greggs/My_Greggs_Note_FINAL.docx
@@ -452,7 +452,7 @@
         <w:t>The agile model:</w:t>
       </w:r>
       <w:r>
-        <w:t xml:space="preserve"> Today, Greggs has a low level of agility, because every shop follows head-office rules. It should aim for a medium level, with agile working only for the app project (Curchod, 2026b). </w:t>
+        <w:t xml:space="preserve"> Today, Greggs is at level 2 of the agile maturity model, 'competitive and market orientation', because it focuses on beating rivals on price and every shop follows head-office rules. It should aim for level 3, 'customer orientation', using app data to build around what customers want, with agile working only for the app project (Curchod, 2026b). </w:t>
       </w:r>
       <w:r>
         <w:rPr>
@@ -526,7 +526,7 @@
         <w:rPr>
           <w:b/>
         </w:rPr>
-        <w:t>Word count: 1348 words (excluding headings, figures, captions and reference list)</w:t>
+        <w:t>Word count: 1373 words (excluding headings, figures, captions and reference list)</w:t>
       </w:r>
     </w:p>
     <w:p>

</xml_diff>

<commit_message>
Final note: trim to ~1,300 words; Times New Roman 12pt, double spacing, justified, black headings
Co-Authored-By: Claude Opus 5.5 <noreply@anthropic.com>
Claude-Session: https://claude.ai/code/session_01Xu2Epx64Wygh8wfGcyNeKH
</commit_message>
<xml_diff>
--- a/Mid-term note - Greggs/My_Greggs_Note_FINAL.docx
+++ b/Mid-term note - Greggs/My_Greggs_Note_FINAL.docx
@@ -10,8 +10,8 @@
       <w:r>
         <w:rPr>
           <w:b/>
-          <w:color w:val="1F3A5F"/>
-          <w:sz w:val="36"/>
+          <w:color w:val="000000"/>
+          <w:sz w:val="24"/>
         </w:rPr>
         <w:t>Greggs plc: Using App Data to Bake Smarter</w:t>
       </w:r>
@@ -20,7 +20,7 @@
       <w:r>
         <w:rPr>
           <w:i/>
-          <w:color w:val="55606E"/>
+          <w:sz w:val="24"/>
         </w:rPr>
         <w:t>Mid-term note – The Strategy of Digital Transformation – 30 October 2026</w:t>
       </w:r>
@@ -33,8 +33,8 @@
       <w:r>
         <w:rPr>
           <w:b/>
-          <w:color w:val="1F3A5F"/>
-          <w:sz w:val="26"/>
+          <w:color w:val="000000"/>
+          <w:sz w:val="24"/>
         </w:rPr>
         <w:t>Introduction</w:t>
       </w:r>
@@ -44,7 +44,7 @@
         <w:jc w:val="both"/>
       </w:pPr>
       <w:r>
-        <w:t>Greggs is a UK-based company that sells food, and it has around 2,700 branches (Greggs plc, 2026). Its profit went down by about 4% (Greggs plc, 2026), and the cost of hiring staff also went up (HM Treasury, 2024). The shops do not bake based on customer demand; they rely on their own guesses, which leads to leftover food. Using the information from everyday orders on the app, Greggs can predict what to bake in future, which will also help it plan how many staff it needs. I chose Greggs because I buy from it myself: there is a shop close to my university, and I find it reliable.</w:t>
+        <w:t>Greggs is a UK-based company that sells food, and it has around 2,700 branches (Greggs plc, 2026). Its profit went down by about 4% (Greggs plc, 2026), and the cost of hiring staff also went up (HM Treasury, 2024). The shops do not bake based on customer demand; they rely on their own guesses, which leads to leftover food. Using the information from everyday orders on the app, Greggs can predict what to bake, which will also help it plan how many staff it needs. I chose Greggs because I buy from it myself: there is a shop close to my university, and I find it reliable.</w:t>
       </w:r>
     </w:p>
     <w:p>
@@ -55,8 +55,8 @@
       <w:r>
         <w:rPr>
           <w:b/>
-          <w:color w:val="1F3A5F"/>
-          <w:sz w:val="26"/>
+          <w:color w:val="000000"/>
+          <w:sz w:val="24"/>
         </w:rPr>
         <w:t>1. Value opportunities</w:t>
       </w:r>
@@ -72,7 +72,7 @@
         <w:t>Economic:</w:t>
       </w:r>
       <w:r>
-        <w:t xml:space="preserve"> People have less money, so they buy cheaper things. This means Greggs cannot simply raise its prices to cover higher staff costs (HM Treasury, 2024), because it would lose customers. Near my university, I could also buy cheap food at McDonald's or Subway. I still choose Greggs because it is reliable. This shows that customers can easily go somewhere else, so Greggs has to keep its prices low (Porter, 2008).</w:t>
+        <w:t xml:space="preserve"> People have less money, so they buy cheaper things. This means Greggs cannot simply raise its prices to cover higher staff costs (HM Treasury, 2024), because it would lose customers. Near my university, I could also buy cheap food at McDonald's or Subway. This shows that customers can easily go somewhere else, so Greggs has to keep its prices low (Porter, 2008).</w:t>
       </w:r>
     </w:p>
     <w:p>
@@ -100,7 +100,7 @@
         <w:t>Environmental:</w:t>
       </w:r>
       <w:r>
-        <w:t xml:space="preserve"> Leftover food makes Greggs lose money, because that food could have been sold for a profit. Instead, it goes bad or is given away. Greggs already sells some leftover food cheaply at the end of the day through the Too Good To Go app, which has saved more than 5 million meals since 2021 (Grocery Gazette, 2025). This helps, but Greggs earns much less than it would by selling the food at full price. It would be better not to bake too much in the first place.</w:t>
+        <w:t xml:space="preserve"> Leftover food makes Greggs lose money, because that food could have been sold for a profit. Greggs already sells some leftover food cheaply at the end of the day through the Too Good To Go app (Grocery Gazette, 2025). This helps, but Greggs earns much less than it would by selling the food at full price. It would be better not to bake too much in the first place.</w:t>
       </w:r>
     </w:p>
     <w:p>
@@ -111,8 +111,8 @@
       <w:r>
         <w:rPr>
           <w:b/>
-          <w:color w:val="1F3A5F"/>
-          <w:sz w:val="26"/>
+          <w:color w:val="000000"/>
+          <w:sz w:val="24"/>
         </w:rPr>
         <w:t>2. How the business model will change</w:t>
       </w:r>
@@ -241,7 +241,7 @@
       <w:r>
         <w:rPr>
           <w:i/>
-          <w:sz w:val="19"/>
+          <w:sz w:val="24"/>
         </w:rPr>
         <w:t>Figure 1: Google "Order online" options for Greggs, delivery (left) and pickup (right) (my own screenshots, 30 October 2026)</w:t>
       </w:r>
@@ -251,7 +251,7 @@
         <w:jc w:val="both"/>
       </w:pPr>
       <w:r>
-        <w:t>Using the information from everyday orders on the app, Greggs can predict what to bake (P2), which will also help it plan how many staff it needs. This means less leftover food, which could instead be sold for a profit.</w:t>
+        <w:t>Using the information from everyday orders on the app, Greggs can predict what to bake (P2), which will also help it plan how many staff it needs.</w:t>
       </w:r>
     </w:p>
     <w:p>
@@ -308,7 +308,7 @@
       <w:r>
         <w:rPr>
           <w:i/>
-          <w:sz w:val="19"/>
+          <w:sz w:val="24"/>
         </w:rPr>
         <w:t>Figure 2: Current versus proposed Greggs business model</w:t>
       </w:r>
@@ -321,8 +321,8 @@
       <w:r>
         <w:rPr>
           <w:b/>
-          <w:color w:val="1F3A5F"/>
-          <w:sz w:val="26"/>
+          <w:color w:val="000000"/>
+          <w:sz w:val="24"/>
         </w:rPr>
         <w:t>3. Competitive advantage</w:t>
       </w:r>
@@ -332,7 +332,7 @@
         <w:jc w:val="both"/>
       </w:pPr>
       <w:r>
-        <w:t>Greggs has a hybrid competitive advantage: it is cheaper than rivals such as Subway, but it also has something special, like its famous sausage roll (Whittington et al., 2024). My plan makes both sides stronger. Less food thrown away and not paying Uber Eats a cut save Greggs money, which helps it stay cheap. Fewer sold-out items and skipping the queue by ordering ahead make customers happier, which makes Greggs more special. Rivals such as Tesco could also build an app, so the app alone is not special. What they cannot easily copy is that Greggs has its own bakeries and lorries, so it can use app data to change what is baked and delivered to each shop (Porter, 1996).</w:t>
+        <w:t>Greggs has a hybrid competitive advantage: it is cheaper than rivals such as Subway, but it also has something special, like its famous sausage roll (Whittington et al., 2024). Less food thrown away and not paying Uber Eats a cut save Greggs money, which helps it stay cheap. Fewer sold-out items and skipping the queue by ordering ahead make customers happier, which makes Greggs more special. Rivals such as Tesco could also build an app, so the app alone is not special. What they cannot easily copy is that Greggs has its own bakeries and lorries, so it can use app data to change what is baked and delivered to each shop (Porter, 1996).</w:t>
       </w:r>
     </w:p>
     <w:p>
@@ -343,8 +343,8 @@
       <w:r>
         <w:rPr>
           <w:b/>
-          <w:color w:val="1F3A5F"/>
-          <w:sz w:val="26"/>
+          <w:color w:val="000000"/>
+          <w:sz w:val="24"/>
         </w:rPr>
         <w:t>4. Challenges</w:t>
       </w:r>
@@ -354,7 +354,7 @@
         <w:jc w:val="both"/>
       </w:pPr>
       <w:r>
-        <w:t>About 70% of digital transformations fail to meet their goals (McKinsey, 2025, cited in Curchod, 2026d), so these challenges matter.</w:t>
+        <w:t>About 70% of digital transformations fail to meet their goals (McKinsey, 2025, cited in Curchod, 2026d).</w:t>
       </w:r>
     </w:p>
     <w:p>
@@ -396,7 +396,7 @@
         <w:t>Company habits:</w:t>
       </w:r>
       <w:r>
-        <w:t xml:space="preserve"> Greggs has had record sales doing things its own way, so people may ask why it should change. This is a competency trap, where the strengths that made a company successful stop it from changing, as happened to Nokia (Leonard-Barton, 1992).</w:t>
+        <w:t xml:space="preserve"> Greggs has had record sales doing things its own way, so people may ask why it should change. This is a competency trap, as happened to Nokia (Leonard-Barton, 1992).</w:t>
       </w:r>
     </w:p>
     <w:p>
@@ -407,8 +407,8 @@
       <w:r>
         <w:rPr>
           <w:b/>
-          <w:color w:val="1F3A5F"/>
-          <w:sz w:val="26"/>
+          <w:color w:val="000000"/>
+          <w:sz w:val="24"/>
         </w:rPr>
         <w:t>5. Overcoming the challenges</w:t>
       </w:r>
@@ -504,8 +504,8 @@
       <w:r>
         <w:rPr>
           <w:b/>
-          <w:color w:val="1F3A5F"/>
-          <w:sz w:val="26"/>
+          <w:color w:val="000000"/>
+          <w:sz w:val="24"/>
         </w:rPr>
         <w:t>Conclusion</w:t>
       </w:r>
@@ -526,7 +526,7 @@
         <w:rPr>
           <w:b/>
         </w:rPr>
-        <w:t>Word count: 1373 words (excluding headings, figures, captions and reference list)</w:t>
+        <w:t>Word count: 1310 words (excluding headings, figures, captions and reference list)</w:t>
       </w:r>
     </w:p>
     <w:p>
@@ -537,345 +537,345 @@
       <w:r>
         <w:rPr>
           <w:b/>
-          <w:color w:val="1F3A5F"/>
-          <w:sz w:val="26"/>
+          <w:color w:val="000000"/>
+          <w:sz w:val="24"/>
         </w:rPr>
         <w:t>Reference list</w:t>
       </w:r>
     </w:p>
     <w:p>
       <w:pPr>
-        <w:spacing w:after="80"/>
+        <w:spacing w:after="0"/>
         <w:ind w:left="567" w:hanging="567"/>
       </w:pPr>
       <w:r>
         <w:rPr>
-          <w:sz w:val="20"/>
+          <w:sz w:val="24"/>
         </w:rPr>
         <w:t xml:space="preserve">Collis, D. (2021) 'Why do so many strategies fail?', </w:t>
       </w:r>
       <w:r>
         <w:rPr>
           <w:i/>
-          <w:sz w:val="20"/>
+          <w:sz w:val="24"/>
         </w:rPr>
         <w:t>Harvard Business Review</w:t>
       </w:r>
       <w:r>
         <w:rPr>
-          <w:sz w:val="20"/>
+          <w:sz w:val="24"/>
         </w:rPr>
         <w:t>, 99(4). Available at: https://hbr.org/2021/07/why-do-so-many-strategies-fail (Accessed: 30 October 2026).</w:t>
       </w:r>
     </w:p>
     <w:p>
       <w:pPr>
-        <w:spacing w:after="80"/>
+        <w:spacing w:after="0"/>
         <w:ind w:left="567" w:hanging="567"/>
       </w:pPr>
       <w:r>
         <w:rPr>
-          <w:sz w:val="20"/>
+          <w:sz w:val="24"/>
         </w:rPr>
         <w:t xml:space="preserve">Curchod, C. (2026a) 'The challenges ahead: potential obstacles to transformation and how to overcome them' [Lecture slides], </w:t>
       </w:r>
       <w:r>
         <w:rPr>
           <w:i/>
-          <w:sz w:val="20"/>
+          <w:sz w:val="24"/>
         </w:rPr>
         <w:t>The Strategy of Digital Transformation</w:t>
       </w:r>
       <w:r>
         <w:rPr>
-          <w:sz w:val="20"/>
+          <w:sz w:val="24"/>
         </w:rPr>
         <w:t>. University of Edinburgh Business School. Available at: Learn (Accessed: 30 October 2026).</w:t>
       </w:r>
     </w:p>
     <w:p>
       <w:pPr>
-        <w:spacing w:after="80"/>
+        <w:spacing w:after="0"/>
         <w:ind w:left="567" w:hanging="567"/>
       </w:pPr>
       <w:r>
         <w:rPr>
-          <w:sz w:val="20"/>
+          <w:sz w:val="24"/>
         </w:rPr>
         <w:t xml:space="preserve">Curchod, C. (2026b) 'Organizing for digital transformation: the agile organization' [Lecture slides], </w:t>
       </w:r>
       <w:r>
         <w:rPr>
           <w:i/>
-          <w:sz w:val="20"/>
+          <w:sz w:val="24"/>
         </w:rPr>
         <w:t>The Strategy of Digital Transformation</w:t>
       </w:r>
       <w:r>
         <w:rPr>
-          <w:sz w:val="20"/>
+          <w:sz w:val="24"/>
         </w:rPr>
         <w:t>. University of Edinburgh Business School. Available at: Learn (Accessed: 30 October 2026).</w:t>
       </w:r>
     </w:p>
     <w:p>
       <w:pPr>
-        <w:spacing w:after="80"/>
+        <w:spacing w:after="0"/>
         <w:ind w:left="567" w:hanging="567"/>
       </w:pPr>
       <w:r>
         <w:rPr>
-          <w:sz w:val="20"/>
+          <w:sz w:val="24"/>
         </w:rPr>
         <w:t xml:space="preserve">Curchod, C. (2026c) 'Beware national cultures: an exploration of the East vs. West digital ecosystems' [Lecture slides], </w:t>
       </w:r>
       <w:r>
         <w:rPr>
           <w:i/>
-          <w:sz w:val="20"/>
+          <w:sz w:val="24"/>
         </w:rPr>
         <w:t>The Strategy of Digital Transformation</w:t>
       </w:r>
       <w:r>
         <w:rPr>
-          <w:sz w:val="20"/>
+          <w:sz w:val="24"/>
         </w:rPr>
         <w:t>. University of Edinburgh Business School. Available at: Learn (Accessed: 30 October 2026).</w:t>
       </w:r>
     </w:p>
     <w:p>
       <w:pPr>
-        <w:spacing w:after="80"/>
+        <w:spacing w:after="0"/>
         <w:ind w:left="567" w:hanging="567"/>
       </w:pPr>
       <w:r>
         <w:rPr>
-          <w:sz w:val="20"/>
+          <w:sz w:val="24"/>
         </w:rPr>
         <w:t xml:space="preserve">Curchod, C. (2026d) 'Strategy starts with value opportunities: macro, industry and firm-level analysis in the digital age' [Lecture slides], </w:t>
       </w:r>
       <w:r>
         <w:rPr>
           <w:i/>
-          <w:sz w:val="20"/>
+          <w:sz w:val="24"/>
         </w:rPr>
         <w:t>The Strategy of Digital Transformation</w:t>
       </w:r>
       <w:r>
         <w:rPr>
-          <w:sz w:val="20"/>
+          <w:sz w:val="24"/>
         </w:rPr>
         <w:t>. University of Edinburgh Business School. Available at: Learn (Accessed: 30 October 2026).</w:t>
       </w:r>
     </w:p>
     <w:p>
       <w:pPr>
-        <w:spacing w:after="80"/>
+        <w:spacing w:after="0"/>
         <w:ind w:left="567" w:hanging="567"/>
       </w:pPr>
       <w:r>
         <w:rPr>
-          <w:sz w:val="20"/>
+          <w:sz w:val="24"/>
         </w:rPr>
         <w:t xml:space="preserve">Greggs plc (2026) </w:t>
       </w:r>
       <w:r>
         <w:rPr>
           <w:i/>
-          <w:sz w:val="20"/>
+          <w:sz w:val="24"/>
         </w:rPr>
         <w:t>Preliminary results for the 52 weeks ended 27 December 2025</w:t>
       </w:r>
       <w:r>
         <w:rPr>
-          <w:sz w:val="20"/>
+          <w:sz w:val="24"/>
         </w:rPr>
         <w:t>. Newcastle upon Tyne: Greggs plc. Available at: https://assets.greggs.com/f/162306/x/e616871d6c/260303-greggs-2025-preliminary-results-final.pdf (Accessed: 30 October 2026).</w:t>
       </w:r>
     </w:p>
     <w:p>
       <w:pPr>
-        <w:spacing w:after="80"/>
+        <w:spacing w:after="0"/>
         <w:ind w:left="567" w:hanging="567"/>
       </w:pPr>
       <w:r>
         <w:rPr>
-          <w:sz w:val="20"/>
+          <w:sz w:val="24"/>
         </w:rPr>
         <w:t>Grocery Gazette (2025) 'Greggs saves 5m meals from waste with Too Good To Go', 30 April. Available at: https://www.grocerygazette.co.uk/2025/04/30/greggs-too-good-to-go/ (Accessed: 30 October 2026).</w:t>
       </w:r>
     </w:p>
     <w:p>
       <w:pPr>
-        <w:spacing w:after="80"/>
+        <w:spacing w:after="0"/>
         <w:ind w:left="567" w:hanging="567"/>
       </w:pPr>
       <w:r>
         <w:rPr>
-          <w:sz w:val="20"/>
+          <w:sz w:val="24"/>
         </w:rPr>
         <w:t xml:space="preserve">HM Treasury (2024) </w:t>
       </w:r>
       <w:r>
         <w:rPr>
           <w:i/>
-          <w:sz w:val="20"/>
+          <w:sz w:val="24"/>
         </w:rPr>
         <w:t>Autumn Budget 2024</w:t>
       </w:r>
       <w:r>
         <w:rPr>
-          <w:sz w:val="20"/>
+          <w:sz w:val="24"/>
         </w:rPr>
         <w:t xml:space="preserve"> (HC 295). London: HM Treasury. Available at: https://www.gov.uk/government/publications/autumn-budget-2024 (Accessed: 30 October 2026).</w:t>
       </w:r>
     </w:p>
     <w:p>
       <w:pPr>
-        <w:spacing w:after="80"/>
+        <w:spacing w:after="0"/>
         <w:ind w:left="567" w:hanging="567"/>
       </w:pPr>
       <w:r>
         <w:rPr>
-          <w:sz w:val="20"/>
+          <w:sz w:val="24"/>
         </w:rPr>
         <w:t xml:space="preserve">Leonard-Barton, D. (1992) 'Core capabilities and core rigidities: a paradox in managing new product development', </w:t>
       </w:r>
       <w:r>
         <w:rPr>
           <w:i/>
-          <w:sz w:val="20"/>
+          <w:sz w:val="24"/>
         </w:rPr>
         <w:t>Strategic Management Journal</w:t>
       </w:r>
       <w:r>
         <w:rPr>
-          <w:sz w:val="20"/>
+          <w:sz w:val="24"/>
         </w:rPr>
         <w:t>, 13(S1), pp. 111–125. doi: 10.1002/smj.4250131009.</w:t>
       </w:r>
     </w:p>
     <w:p>
       <w:pPr>
-        <w:spacing w:after="80"/>
+        <w:spacing w:after="0"/>
         <w:ind w:left="567" w:hanging="567"/>
       </w:pPr>
       <w:r>
         <w:rPr>
-          <w:sz w:val="20"/>
+          <w:sz w:val="24"/>
         </w:rPr>
         <w:t xml:space="preserve">O'Reilly, C.A. and Tushman, M.L. (2004) 'The ambidextrous organization', </w:t>
       </w:r>
       <w:r>
         <w:rPr>
           <w:i/>
-          <w:sz w:val="20"/>
+          <w:sz w:val="24"/>
         </w:rPr>
         <w:t>Harvard Business Review</w:t>
       </w:r>
       <w:r>
         <w:rPr>
-          <w:sz w:val="20"/>
+          <w:sz w:val="24"/>
         </w:rPr>
         <w:t>, 82(4), pp. 74–81.</w:t>
       </w:r>
     </w:p>
     <w:p>
       <w:pPr>
-        <w:spacing w:after="80"/>
+        <w:spacing w:after="0"/>
         <w:ind w:left="567" w:hanging="567"/>
       </w:pPr>
       <w:r>
         <w:rPr>
-          <w:sz w:val="20"/>
+          <w:sz w:val="24"/>
         </w:rPr>
         <w:t xml:space="preserve">Porter, M.E. (1996) 'What is strategy?', </w:t>
       </w:r>
       <w:r>
         <w:rPr>
           <w:i/>
-          <w:sz w:val="20"/>
+          <w:sz w:val="24"/>
         </w:rPr>
         <w:t>Harvard Business Review</w:t>
       </w:r>
       <w:r>
         <w:rPr>
-          <w:sz w:val="20"/>
+          <w:sz w:val="24"/>
         </w:rPr>
         <w:t>, 74(6), pp. 61–78.</w:t>
       </w:r>
     </w:p>
     <w:p>
       <w:pPr>
-        <w:spacing w:after="80"/>
+        <w:spacing w:after="0"/>
         <w:ind w:left="567" w:hanging="567"/>
       </w:pPr>
       <w:r>
         <w:rPr>
-          <w:sz w:val="20"/>
+          <w:sz w:val="24"/>
         </w:rPr>
         <w:t xml:space="preserve">Porter, M.E. (2008) 'The five competitive forces that shape strategy', </w:t>
       </w:r>
       <w:r>
         <w:rPr>
           <w:i/>
-          <w:sz w:val="20"/>
+          <w:sz w:val="24"/>
         </w:rPr>
         <w:t>Harvard Business Review</w:t>
       </w:r>
       <w:r>
         <w:rPr>
-          <w:sz w:val="20"/>
+          <w:sz w:val="24"/>
         </w:rPr>
         <w:t>, 86(1), pp. 78–93.</w:t>
       </w:r>
     </w:p>
     <w:p>
       <w:pPr>
-        <w:spacing w:after="80"/>
+        <w:spacing w:after="0"/>
         <w:ind w:left="567" w:hanging="567"/>
       </w:pPr>
       <w:r>
         <w:rPr>
-          <w:sz w:val="20"/>
+          <w:sz w:val="24"/>
         </w:rPr>
         <w:t xml:space="preserve">Teece, D.J. (2007) 'Explicating dynamic capabilities: the nature and microfoundations of (sustainable) enterprise performance', </w:t>
       </w:r>
       <w:r>
         <w:rPr>
           <w:i/>
-          <w:sz w:val="20"/>
+          <w:sz w:val="24"/>
         </w:rPr>
         <w:t>Strategic Management Journal</w:t>
       </w:r>
       <w:r>
         <w:rPr>
-          <w:sz w:val="20"/>
+          <w:sz w:val="24"/>
         </w:rPr>
         <w:t>, 28(13), pp. 1319–1350. doi: 10.1002/smj.640.</w:t>
       </w:r>
     </w:p>
     <w:p>
       <w:pPr>
-        <w:spacing w:after="80"/>
+        <w:spacing w:after="0"/>
         <w:ind w:left="567" w:hanging="567"/>
       </w:pPr>
       <w:r>
         <w:rPr>
-          <w:sz w:val="20"/>
+          <w:sz w:val="24"/>
         </w:rPr>
         <w:t xml:space="preserve">Whittington, R., Regnér, P., Angwin, D., Johnson, G. and Scholes, K. (2024) </w:t>
       </w:r>
       <w:r>
         <w:rPr>
           <w:i/>
-          <w:sz w:val="20"/>
+          <w:sz w:val="24"/>
         </w:rPr>
         <w:t>Fundamentals of strategy</w:t>
       </w:r>
       <w:r>
         <w:rPr>
-          <w:sz w:val="20"/>
+          <w:sz w:val="24"/>
         </w:rPr>
         <w:t>. 6th edn. Harlow: Pearson.</w:t>
       </w:r>
@@ -1254,11 +1254,13 @@
     <w:qFormat/>
     <w:rsid w:val="00FC693F"/>
     <w:pPr>
-      <w:spacing w:after="120" w:line="276" w:lineRule="auto"/>
+      <w:spacing w:after="0" w:line="480" w:lineRule="auto"/>
+      <w:jc w:val="both"/>
     </w:pPr>
     <w:rPr>
-      <w:rFonts w:ascii="Calibri" w:hAnsi="Calibri" w:eastAsia="Calibri"/>
-      <w:sz w:val="22"/>
+      <w:rFonts w:ascii="Times New Roman" w:hAnsi="Times New Roman" w:eastAsia="Times New Roman" w:cs="Times New Roman"/>
+      <w:color w:val="000000"/>
+      <w:sz w:val="24"/>
     </w:rPr>
   </w:style>
   <w:style w:type="paragraph" w:styleId="Header">

</xml_diff>

<commit_message>
Final note: add depth to sections 1, 4 and 5
Co-Authored-By: Claude Opus 5.5 <noreply@anthropic.com>
Claude-Session: https://claude.ai/code/session_01Xu2Epx64Wygh8wfGcyNeKH
</commit_message>
<xml_diff>
--- a/Mid-term note - Greggs/My_Greggs_Note_FINAL.docx
+++ b/Mid-term note - Greggs/My_Greggs_Note_FINAL.docx
@@ -86,7 +86,7 @@
         <w:t>Social:</w:t>
       </w:r>
       <w:r>
-        <w:t xml:space="preserve"> When people order through the Greggs app, Greggs keeps more of the money. When they order through delivery apps like Uber Eats, part of the money goes to the app, so Greggs loses out (Greggs plc, 2026). Evening is also Greggs' fastest-growing time of day, at 9.4% of sales in 2025 (Greggs plc, 2026). Students studying late, like those at my university, and people finishing work or late shifts want cheap food in the evening. This means shops need to bake different food at night, such as pizza instead of breakfast items, which is hard to get right by guessing.</w:t>
+        <w:t xml:space="preserve"> When people order through the Greggs app, Greggs keeps more of the money. When they order through delivery apps like Uber Eats, part of the money goes to the app, so Greggs loses out (Greggs plc, 2026). Greggs cannot simply leave these apps, because many customers open Uber Eats first and choose from many restaurants, so Greggs needs to be there or it loses those customers. This gives the delivery apps bargaining power over Greggs (Porter, 2008). Evening is also Greggs' fastest-growing time of day, at 9.4% of sales in 2025 (Greggs plc, 2026). Students studying late, like those at my university, and people finishing work or late shifts want cheap food in the evening. This means shops need to bake different food at night, such as pizza instead of breakfast items, which is hard to get right by guessing.</w:t>
       </w:r>
     </w:p>
     <w:p>
@@ -396,7 +396,7 @@
         <w:t>Company habits:</w:t>
       </w:r>
       <w:r>
-        <w:t xml:space="preserve"> Greggs has had record sales doing things its own way, so people may ask why it should change. This is a competency trap, as happened to Nokia (Leonard-Barton, 1992).</w:t>
+        <w:t xml:space="preserve"> Greggs has had record sales doing things its own way, so people may ask why it should change. This is a competency trap, as happened to Nokia (Leonard-Barton, 1992). For Greggs, the risk is real: it became successful through head-office control and the same recipes in every shop, and that same control could make it slow to let app data change how each shop bakes.</w:t>
       </w:r>
     </w:p>
     <w:p>
@@ -438,7 +438,7 @@
         <w:t>Fixing the leaders' challenge:</w:t>
       </w:r>
       <w:r>
-        <w:t xml:space="preserve"> Greggs should set up a small separate team for this project, so the rest of the business keeps running normally. This is called ambidexterity (O'Reilly and Tushman, 2004). The team should first test the system in about 50 shops in one city. This costs little, and if it works, leaders will have proof before spending more. Building this habit of testing new ideas creates dynamic capabilities (Teece, 2007).</w:t>
+        <w:t xml:space="preserve"> Greggs should set up a small separate team for this project, so the rest of the business keeps running normally. This is called ambidexterity (O'Reilly and Tushman, 2004). The team should first test the system in about 50 shops in one city. This costs little, and if it works, leaders will have proof before spending more. Leaders who are worried about money are more likely to trust real results, such as less waste and more sales, than a promise. Building this habit of testing new ideas creates dynamic capabilities (Teece, 2007).</w:t>
       </w:r>
     </w:p>
     <w:p>
@@ -526,7 +526,7 @@
         <w:rPr>
           <w:b/>
         </w:rPr>
-        <w:t>Word count: 1310 words (excluding headings, figures, captions and reference list)</w:t>
+        <w:t>Word count: 1409 words (excluding headings, figures, captions and reference list)</w:t>
       </w:r>
     </w:p>
     <w:p>

</xml_diff>

<commit_message>
Final note: trim to 1,297 words
Co-Authored-By: Claude Opus 5.5 <noreply@anthropic.com>
Claude-Session: https://claude.ai/code/session_01Xu2Epx64Wygh8wfGcyNeKH
</commit_message>
<xml_diff>
--- a/Mid-term note - Greggs/My_Greggs_Note_FINAL.docx
+++ b/Mid-term note - Greggs/My_Greggs_Note_FINAL.docx
@@ -44,7 +44,7 @@
         <w:jc w:val="both"/>
       </w:pPr>
       <w:r>
-        <w:t>Greggs is a UK-based company that sells food, and it has around 2,700 branches (Greggs plc, 2026). Its profit went down by about 4% (Greggs plc, 2026), and the cost of hiring staff also went up (HM Treasury, 2024). The shops do not bake based on customer demand; they rely on their own guesses, which leads to leftover food. Using the information from everyday orders on the app, Greggs can predict what to bake, which will also help it plan how many staff it needs. I chose Greggs because I buy from it myself: there is a shop close to my university, and I find it reliable.</w:t>
+        <w:t>Greggs is a UK-based company that sells food, and it has around 2,700 branches (Greggs plc, 2026). Its profit went down by about 4% (Greggs plc, 2026), and the cost of hiring staff also went up (HM Treasury, 2024). The shops do not bake based on customer demand; they rely on their own guesses, which leads to leftover food. Using the information from everyday orders on the app, Greggs can predict what to bake. I chose Greggs because I buy from it myself: there is a shop close to my university, and I find it reliable.</w:t>
       </w:r>
     </w:p>
     <w:p>
@@ -86,7 +86,7 @@
         <w:t>Social:</w:t>
       </w:r>
       <w:r>
-        <w:t xml:space="preserve"> When people order through the Greggs app, Greggs keeps more of the money. When they order through delivery apps like Uber Eats, part of the money goes to the app, so Greggs loses out (Greggs plc, 2026). Greggs cannot simply leave these apps, because many customers open Uber Eats first and choose from many restaurants, so Greggs needs to be there or it loses those customers. This gives the delivery apps bargaining power over Greggs (Porter, 2008). Evening is also Greggs' fastest-growing time of day, at 9.4% of sales in 2025 (Greggs plc, 2026). Students studying late, like those at my university, and people finishing work or late shifts want cheap food in the evening. This means shops need to bake different food at night, such as pizza instead of breakfast items, which is hard to get right by guessing.</w:t>
+        <w:t xml:space="preserve"> When people order through the Greggs app, Greggs keeps more of the money. When they order through delivery apps like Uber Eats, part of the money goes to the app, so Greggs loses out (Greggs plc, 2026). Greggs cannot simply leave these apps, because many customers open Uber Eats first and choose from many restaurants, so Greggs needs to be there or it loses those customers. This gives the delivery apps bargaining power over Greggs (Porter, 2008). Evening is also Greggs' fastest-growing time of day, at 9.4% of sales in 2025 (Greggs plc, 2026). Students studying late and people finishing work or late shifts want cheap food in the evening. This means shops need to bake different food at night, such as pizza instead of breakfast items, which is hard to get right by guessing.</w:t>
       </w:r>
     </w:p>
     <w:p>
@@ -100,7 +100,7 @@
         <w:t>Environmental:</w:t>
       </w:r>
       <w:r>
-        <w:t xml:space="preserve"> Leftover food makes Greggs lose money, because that food could have been sold for a profit. Greggs already sells some leftover food cheaply at the end of the day through the Too Good To Go app (Grocery Gazette, 2025). This helps, but Greggs earns much less than it would by selling the food at full price. It would be better not to bake too much in the first place.</w:t>
+        <w:t xml:space="preserve"> Leftover food makes Greggs lose money, because that food could have been sold for a profit. Greggs already sells some leftover food cheaply through the Too Good To Go app (Grocery Gazette, 2025). This helps, but Greggs earns much less than it would by selling the food at full price. It would be better not to bake too much in the first place.</w:t>
       </w:r>
     </w:p>
     <w:p>
@@ -122,7 +122,7 @@
         <w:jc w:val="both"/>
       </w:pPr>
       <w:r>
-        <w:t>Greggs gives customers cheap food in shops that are close by and reliable (value creation, C1 in Figure 2). However, each shop does not bake based on customer demand; it relies on its own guesses, which leads to leftover food (value configuration, C2). Greggs makes money by selling lots of cheap items to lots of people (value capture, C3) (Greggs plc, 2026).</w:t>
+        <w:t>Greggs gives customers cheap food in shops that are close by and reliable (value creation, C1 in Figure 2). However, each shop still guesses how much to bake (value configuration, C2). Greggs makes money by selling lots of cheap items to lots of people (value capture, C3) (Greggs plc, 2026).</w:t>
       </w:r>
     </w:p>
     <w:p>
@@ -130,7 +130,7 @@
         <w:jc w:val="both"/>
       </w:pPr>
       <w:r>
-        <w:t>When I searched for Greggs on Google on 30 October 2026, the "Order online" page offered delivery through Uber Eats, Just Eat and greggs.com, and Uber Eats showed a service fee of 5–15% (Figure 1). When I chose pickup, only Uber Eats and Just Eat appeared; Greggs' own app was not offered. This means that even customers who collect their food themselves may order through these apps, so part of the money goes to them and Greggs loses out.</w:t>
+        <w:t>When I searched for Greggs on Google on 30 October 2026, the "Order online" page offered delivery through Uber Eats, Just Eat and greggs.com, and Uber Eats showed a service fee of 5–15% (Figure 1). When I chose pickup, only Uber Eats and Just Eat appeared; Greggs' own app was not offered. This means that even customers who collect their food themselves may order through these apps.</w:t>
       </w:r>
     </w:p>
     <w:tbl>
@@ -259,58 +259,7 @@
         <w:jc w:val="both"/>
       </w:pPr>
       <w:r>
-        <w:t>With this plan, customers would find their favourite items sold out less often, and they could skip the queue by ordering ahead in the app (new value creation, P1). This matters to me: once at lunchtime, the item I wanted was sold out, so I left and went to Subway, and Greggs lost that sale. With the new plan, Greggs would throw away less food and would not pay Uber Eats a cut on orders made in its own app (new value capture, P3). This links value creation to value capture, as a strategy should (Collis, 2021). Figure 2 compares the current business model with the new one.</w:t>
-      </w:r>
-    </w:p>
-    <w:p>
-      <w:pPr>
-        <w:jc w:val="center"/>
-      </w:pPr>
-      <w:r>
-        <w:drawing>
-          <wp:inline xmlns:a="http://schemas.openxmlformats.org/drawingml/2006/main" xmlns:pic="http://schemas.openxmlformats.org/drawingml/2006/picture">
-            <wp:extent cx="5903999" cy="3543069"/>
-            <wp:docPr id="3" name="Picture 3"/>
-            <wp:cNvGraphicFramePr>
-              <a:graphicFrameLocks noChangeAspect="1"/>
-            </wp:cNvGraphicFramePr>
-            <a:graphic>
-              <a:graphicData uri="http://schemas.openxmlformats.org/drawingml/2006/picture">
-                <pic:pic>
-                  <pic:nvPicPr>
-                    <pic:cNvPr id="0" name="figure2.png"/>
-                    <pic:cNvPicPr/>
-                  </pic:nvPicPr>
-                  <pic:blipFill>
-                    <a:blip r:embed="rId11"/>
-                    <a:stretch>
-                      <a:fillRect/>
-                    </a:stretch>
-                  </pic:blipFill>
-                  <pic:spPr>
-                    <a:xfrm>
-                      <a:off x="0" y="0"/>
-                      <a:ext cx="5903999" cy="3543069"/>
-                    </a:xfrm>
-                    <a:prstGeom prst="rect"/>
-                  </pic:spPr>
-                </pic:pic>
-              </a:graphicData>
-            </a:graphic>
-          </wp:inline>
-        </w:drawing>
-      </w:r>
-    </w:p>
-    <w:p>
-      <w:pPr>
-        <w:jc w:val="center"/>
-      </w:pPr>
-      <w:r>
-        <w:rPr>
-          <w:i/>
-          <w:sz w:val="24"/>
-        </w:rPr>
-        <w:t>Figure 2: Current versus proposed Greggs business model</w:t>
+        <w:t>With this plan, customers would find their favourite items sold out less often, and they could skip the queue by ordering ahead in the app (new value creation, P1). This matters to me: once at lunchtime, the item I wanted was sold out, so I left and went to Subway, and Greggs lost that sale. With the new plan, Greggs would throw away less food and would not pay Uber Eats a cut on orders made in its own app (new value capture, P3). This links value creation to value capture, as a strategy should (Collis, 2021).</w:t>
       </w:r>
     </w:p>
     <w:p>
@@ -368,7 +317,7 @@
         <w:t>Staff:</w:t>
       </w:r>
       <w:r>
-        <w:t xml:space="preserve"> shop managers who have always decided how much to bake may resist the new system. Some may be confused because nobody has trained them to use it, and others may be scared that a computer will replace them. The lecture calls this ground-level resistance, caused by a lack of understanding or by fear (Curchod, 2026a).</w:t>
+        <w:t xml:space="preserve"> shop managers may resist the new system. Some may be confused because nobody has trained them to use it, and others may be scared that a computer will replace them. The lecture calls this ground-level resistance, caused by a lack of understanding or by fear (Curchod, 2026a).</w:t>
       </w:r>
     </w:p>
     <w:p>
@@ -438,7 +387,7 @@
         <w:t>Fixing the leaders' challenge:</w:t>
       </w:r>
       <w:r>
-        <w:t xml:space="preserve"> Greggs should set up a small separate team for this project, so the rest of the business keeps running normally. This is called ambidexterity (O'Reilly and Tushman, 2004). The team should first test the system in about 50 shops in one city. This costs little, and if it works, leaders will have proof before spending more. Leaders who are worried about money are more likely to trust real results, such as less waste and more sales, than a promise. Building this habit of testing new ideas creates dynamic capabilities (Teece, 2007).</w:t>
+        <w:t xml:space="preserve"> Greggs should set up a small separate team for this project, so the rest of the business keeps running normally. This is called ambidexterity (O'Reilly and Tushman, 2004). The team should first test the system in about 50 shops. If it works, leaders will have proof before spending more. Leaders who are worried about money are more likely to trust real results, such as less waste and more sales, than a promise. Building this habit of testing new ideas creates dynamic capabilities (Teece, 2007).</w:t>
       </w:r>
     </w:p>
     <w:p>
@@ -452,7 +401,7 @@
         <w:t>The agile model:</w:t>
       </w:r>
       <w:r>
-        <w:t xml:space="preserve"> Today, Greggs is at level 2 of the agile maturity model, 'competitive and market orientation', because it focuses on beating rivals on price and every shop follows head-office rules. It should aim for level 3, 'customer orientation', using app data to build around what customers want, with agile working only for the app project (Curchod, 2026b). </w:t>
+        <w:t xml:space="preserve"> Today, Greggs is at level 2 of the agile maturity model, 'competitive and market orientation', because it focuses on beating rivals on price. It should aim for level 3, 'customer orientation', using app data to build around what customers want, with agile working only for the app project (Curchod, 2026b). </w:t>
       </w:r>
       <w:r>
         <w:rPr>
@@ -479,7 +428,7 @@
         <w:t>Communication and transparency:</w:t>
       </w:r>
       <w:r>
-        <w:t xml:space="preserve"> because most shop staff do not sit at a computer, Greggs shares the test results through a staff app on their phones, as IKEA did, and managers collect opinions in a short chat at the start of each shift.</w:t>
+        <w:t xml:space="preserve"> because most shop staff do not sit at a computer, Greggs shares the test results through a staff app on their phones, as IKEA did.</w:t>
       </w:r>
     </w:p>
     <w:p>
@@ -493,7 +442,7 @@
         <w:t>National culture:</w:t>
       </w:r>
       <w:r>
-        <w:t xml:space="preserve"> the UK has its own digital ecosystem, and customers already use Uber Eats and Just Eat (Curchod, 2026c). Greggs should not stop working with them, because it would lose customers to rivals such as McDonald's or Subway. Instead, it should keep these partners but give people a reason, such as app-only deals and rewards, to order more through its own app.</w:t>
+        <w:t xml:space="preserve"> the UK has its own digital ecosystem, and customers already use Uber Eats and Just Eat (Curchod, 2026c). Greggs should keep these partners but give people a reason, such as app-only deals and rewards, to order more through its own app.</w:t>
       </w:r>
     </w:p>
     <w:p>
@@ -526,7 +475,7 @@
         <w:rPr>
           <w:b/>
         </w:rPr>
-        <w:t>Word count: 1409 words (excluding headings, figures, captions and reference list)</w:t>
+        <w:t>Word count: 1297 words (excluding headings, figures, captions and reference list)</w:t>
       </w:r>
     </w:p>
     <w:p>

</xml_diff>

<commit_message>
Final note: add page numbers; add optional email and AI acknowledgement drafts
Co-Authored-By: Claude Opus 5.5 <noreply@anthropic.com>
Claude-Session: https://claude.ai/code/session_01Xu2Epx64Wygh8wfGcyNeKH
</commit_message>
<xml_diff>
--- a/Mid-term note - Greggs/My_Greggs_Note_FINAL.docx
+++ b/Mid-term note - Greggs/My_Greggs_Note_FINAL.docx
@@ -168,7 +168,7 @@
                           <pic:cNvPicPr/>
                         </pic:nvPicPr>
                         <pic:blipFill>
-                          <a:blip r:embed="rId9"/>
+                          <a:blip r:embed="rId10"/>
                           <a:stretch>
                             <a:fillRect/>
                           </a:stretch>
@@ -212,7 +212,7 @@
                           <pic:cNvPicPr/>
                         </pic:nvPicPr>
                         <pic:blipFill>
-                          <a:blip r:embed="rId10"/>
+                          <a:blip r:embed="rId11"/>
                           <a:stretch>
                             <a:fillRect/>
                           </a:stretch>
@@ -830,6 +830,7 @@
       </w:r>
     </w:p>
     <w:sectPr>
+      <w:footerReference w:type="default" r:id="rId9"/>
       <w:pgSz w:w="11906" w:h="16838"/>
       <w:pgMar w:top="1247" w:right="1304" w:bottom="1247" w:left="1304" w:header="720" w:footer="720" w:gutter="0"/>
       <w:cols w:space="720"/>
@@ -837,6 +838,36 @@
     </w:sectPr>
   </w:body>
 </w:document>
+</file>
+
+<file path=word/footer1.xml><?xml version="1.0" encoding="utf-8"?>
+<w:ftr xmlns:m="http://schemas.openxmlformats.org/officeDocument/2006/math" xmlns:mc="http://schemas.openxmlformats.org/markup-compatibility/2006" xmlns:mo="http://schemas.microsoft.com/office/mac/office/2008/main" xmlns:mv="urn:schemas-microsoft-com:mac:vml" xmlns:o="urn:schemas-microsoft-com:office:office" xmlns:r="http://schemas.openxmlformats.org/officeDocument/2006/relationships" xmlns:v="urn:schemas-microsoft-com:vml" xmlns:w10="urn:schemas-microsoft-com:office:word" xmlns:w14="http://schemas.microsoft.com/office/word/2010/wordml" xmlns:w="http://schemas.openxmlformats.org/wordprocessingml/2006/main" xmlns:wne="http://schemas.microsoft.com/office/word/2006/wordml" xmlns:wp14="http://schemas.microsoft.com/office/word/2010/wordprocessingDrawing" xmlns:wp="http://schemas.openxmlformats.org/drawingml/2006/wordprocessingDrawing" xmlns:wpc="http://schemas.microsoft.com/office/word/2010/wordprocessingCanvas" xmlns:wpg="http://schemas.microsoft.com/office/word/2010/wordprocessingGroup" xmlns:wpi="http://schemas.microsoft.com/office/word/2010/wordprocessingInk" xmlns:wps="http://schemas.microsoft.com/office/word/2010/wordprocessingShape" mc:Ignorable="w14 wp14">
+  <w:p>
+    <w:pPr>
+      <w:pStyle w:val="Footer"/>
+      <w:spacing w:line="240" w:lineRule="auto"/>
+      <w:jc w:val="center"/>
+    </w:pPr>
+    <w:r>
+      <w:rPr>
+        <w:sz w:val="24"/>
+      </w:rPr>
+      <w:fldChar w:fldCharType="begin"/>
+    </w:r>
+    <w:r>
+      <w:rPr>
+        <w:sz w:val="24"/>
+      </w:rPr>
+      <w:instrText xml:space="preserve">PAGE</w:instrText>
+    </w:r>
+    <w:r>
+      <w:rPr>
+        <w:sz w:val="24"/>
+      </w:rPr>
+      <w:fldChar w:fldCharType="end"/>
+    </w:r>
+  </w:p>
+</w:ftr>
 </file>
 
 <file path=word/numbering.xml><?xml version="1.0" encoding="utf-8"?>

</xml_diff>

<commit_message>
Final note: add friend's answer as customer evidence in section 2
Co-Authored-By: Claude Opus 5.5 <noreply@anthropic.com>
Claude-Session: https://claude.ai/code/session_01Xu2Epx64Wygh8wfGcyNeKH
</commit_message>
<xml_diff>
--- a/Mid-term note - Greggs/My_Greggs_Note_FINAL.docx
+++ b/Mid-term note - Greggs/My_Greggs_Note_FINAL.docx
@@ -259,7 +259,7 @@
         <w:jc w:val="both"/>
       </w:pPr>
       <w:r>
-        <w:t>With this plan, customers would find their favourite items sold out less often, and they could skip the queue by ordering ahead in the app (new value creation, P1). This matters to me: once at lunchtime, the item I wanted was sold out, so I left and went to Subway, and Greggs lost that sale. With the new plan, Greggs would throw away less food and would not pay Uber Eats a cut on orders made in its own app (new value capture, P3). This links value creation to value capture, as a strategy should (Collis, 2021).</w:t>
+        <w:t>With this plan, customers would find their favourite items sold out less often, and they could skip the queue by ordering ahead in the app (new value creation, P1). This matters to me: once at lunchtime, the item I wanted was sold out, so I left and went to Subway, and Greggs lost that sale. However, when I asked a friend whether they had ever found their food sold out at Greggs or seen lots left at closing, they said no. This suggests the problem may be less visible to customers than to Greggs, which sees the cost of waste in its own figures. With the new plan, Greggs would throw away less food and would not pay Uber Eats a cut on orders made in its own app (new value capture, P3). This links value creation to value capture, as a strategy should (Collis, 2021).</w:t>
       </w:r>
     </w:p>
     <w:p>
@@ -475,7 +475,7 @@
         <w:rPr>
           <w:b/>
         </w:rPr>
-        <w:t>Word count: 1297 words (excluding headings, figures, captions and reference list)</w:t>
+        <w:t>Word count: 1346 words (excluding headings, figures, captions and reference list)</w:t>
       </w:r>
     </w:p>
     <w:p>

</xml_diff>

<commit_message>
Final note: use my hand-drawn Figure 2
Co-Authored-By: Claude Opus 5.5 <noreply@anthropic.com>
Claude-Session: https://claude.ai/code/session_01Xu2Epx64Wygh8wfGcyNeKH
</commit_message>
<xml_diff>
--- a/Mid-term note - Greggs/My_Greggs_Note_FINAL.docx
+++ b/Mid-term note - Greggs/My_Greggs_Note_FINAL.docx
@@ -260,6 +260,57 @@
       </w:pPr>
       <w:r>
         <w:t>With this plan, customers would find their favourite items sold out less often, and they could skip the queue by ordering ahead in the app (new value creation, P1). This matters to me: once at lunchtime, the item I wanted was sold out, so I left and went to Subway, and Greggs lost that sale. However, when I asked a friend whether they had ever found their food sold out at Greggs or seen lots left at closing, they said no. This suggests the problem may be less visible to customers than to Greggs, which sees the cost of waste in its own figures. With the new plan, Greggs would throw away less food and would not pay Uber Eats a cut on orders made in its own app (new value capture, P3). This links value creation to value capture, as a strategy should (Collis, 2021).</w:t>
+      </w:r>
+    </w:p>
+    <w:p>
+      <w:pPr>
+        <w:jc w:val="center"/>
+      </w:pPr>
+      <w:r>
+        <w:drawing>
+          <wp:inline xmlns:a="http://schemas.openxmlformats.org/drawingml/2006/main" xmlns:pic="http://schemas.openxmlformats.org/drawingml/2006/picture">
+            <wp:extent cx="5903999" cy="4192762"/>
+            <wp:docPr id="3" name="Picture 3"/>
+            <wp:cNvGraphicFramePr>
+              <a:graphicFrameLocks noChangeAspect="1"/>
+            </wp:cNvGraphicFramePr>
+            <a:graphic>
+              <a:graphicData uri="http://schemas.openxmlformats.org/drawingml/2006/picture">
+                <pic:pic>
+                  <pic:nvPicPr>
+                    <pic:cNvPr id="0" name="figure2_hand.jpg"/>
+                    <pic:cNvPicPr/>
+                  </pic:nvPicPr>
+                  <pic:blipFill>
+                    <a:blip r:embed="rId12"/>
+                    <a:stretch>
+                      <a:fillRect/>
+                    </a:stretch>
+                  </pic:blipFill>
+                  <pic:spPr>
+                    <a:xfrm>
+                      <a:off x="0" y="0"/>
+                      <a:ext cx="5903999" cy="4192762"/>
+                    </a:xfrm>
+                    <a:prstGeom prst="rect"/>
+                  </pic:spPr>
+                </pic:pic>
+              </a:graphicData>
+            </a:graphic>
+          </wp:inline>
+        </w:drawing>
+      </w:r>
+    </w:p>
+    <w:p>
+      <w:pPr>
+        <w:jc w:val="center"/>
+      </w:pPr>
+      <w:r>
+        <w:rPr>
+          <w:i/>
+          <w:sz w:val="24"/>
+        </w:rPr>
+        <w:t>Figure 2: Current versus proposed Greggs business model (my own hand drawing)</w:t>
       </w:r>
     </w:p>
     <w:p>

</xml_diff>

<commit_message>
Final note: clearer version of hand-drawn Figure 2
Co-Authored-By: Claude Opus 5.5 <noreply@anthropic.com>
Claude-Session: https://claude.ai/code/session_01Xu2Epx64Wygh8wfGcyNeKH
</commit_message>
<xml_diff>
--- a/Mid-term note - Greggs/My_Greggs_Note_FINAL.docx
+++ b/Mid-term note - Greggs/My_Greggs_Note_FINAL.docx
@@ -269,7 +269,7 @@
       <w:r>
         <w:drawing>
           <wp:inline xmlns:a="http://schemas.openxmlformats.org/drawingml/2006/main" xmlns:pic="http://schemas.openxmlformats.org/drawingml/2006/picture">
-            <wp:extent cx="5903999" cy="4192762"/>
+            <wp:extent cx="5903999" cy="4326373"/>
             <wp:docPr id="3" name="Picture 3"/>
             <wp:cNvGraphicFramePr>
               <a:graphicFrameLocks noChangeAspect="1"/>
@@ -278,7 +278,7 @@
               <a:graphicData uri="http://schemas.openxmlformats.org/drawingml/2006/picture">
                 <pic:pic>
                   <pic:nvPicPr>
-                    <pic:cNvPr id="0" name="figure2_hand.jpg"/>
+                    <pic:cNvPr id="0" name="figure2_hand_clean.png"/>
                     <pic:cNvPicPr/>
                   </pic:nvPicPr>
                   <pic:blipFill>
@@ -290,7 +290,7 @@
                   <pic:spPr>
                     <a:xfrm>
                       <a:off x="0" y="0"/>
-                      <a:ext cx="5903999" cy="4192762"/>
+                      <a:ext cx="5903999" cy="4326373"/>
                     </a:xfrm>
                     <a:prstGeom prst="rect"/>
                   </pic:spPr>

</xml_diff>

<commit_message>
Final note: add stuck-in-the-middle risk to section 3
Co-Authored-By: Claude Opus 5.5 <noreply@anthropic.com>
Claude-Session: https://claude.ai/code/session_01Xu2Epx64Wygh8wfGcyNeKH
</commit_message>
<xml_diff>
--- a/Mid-term note - Greggs/My_Greggs_Note_FINAL.docx
+++ b/Mid-term note - Greggs/My_Greggs_Note_FINAL.docx
@@ -332,7 +332,7 @@
         <w:jc w:val="both"/>
       </w:pPr>
       <w:r>
-        <w:t>Greggs has a hybrid competitive advantage: it is cheaper than rivals such as Subway, but it also has something special, like its famous sausage roll (Whittington et al., 2024). Less food thrown away and not paying Uber Eats a cut save Greggs money, which helps it stay cheap. Fewer sold-out items and skipping the queue by ordering ahead make customers happier, which makes Greggs more special. Rivals such as Tesco could also build an app, so the app alone is not special. What they cannot easily copy is that Greggs has its own bakeries and lorries, so it can use app data to change what is baked and delivered to each shop (Porter, 1996).</w:t>
+        <w:t>Greggs has a hybrid competitive advantage: it is cheaper than rivals such as Subway, but it also has something special, like its famous sausage roll (Whittington et al., 2024). The danger is that Greggs could end up 'stuck in the middle', not the cheapest and not the most special, and lose customers to both sides (Whittington et al., 2024). My plan helps it avoid this. Less food thrown away and not paying Uber Eats a cut save Greggs money, which helps it stay cheap. Fewer sold-out items and skipping the queue by ordering ahead make customers happier, which makes Greggs more special. Rivals such as Tesco could also build an app, so the app alone is not special. What they cannot easily copy is that Greggs has its own bakeries and lorries, so it can use app data to change what is baked and delivered to each shop (Porter, 1996).</w:t>
       </w:r>
     </w:p>
     <w:p>
@@ -526,7 +526,7 @@
         <w:rPr>
           <w:b/>
         </w:rPr>
-        <w:t>Word count: 1346 words (excluding headings, figures, captions and reference list)</w:t>
+        <w:t>Word count: 1382 words (excluding headings, figures, captions and reference list)</w:t>
       </w:r>
     </w:p>
     <w:p>

</xml_diff>

<commit_message>
Final note: proofreading fixes (capitalisation, citation brackets)
Co-Authored-By: Claude Opus 5.5 <noreply@anthropic.com>
Claude-Session: https://claude.ai/code/session_01Xu2Epx64Wygh8wfGcyNeKH
</commit_message>
<xml_diff>
--- a/Mid-term note - Greggs/My_Greggs_Note_FINAL.docx
+++ b/Mid-term note - Greggs/My_Greggs_Note_FINAL.docx
@@ -122,7 +122,7 @@
         <w:jc w:val="both"/>
       </w:pPr>
       <w:r>
-        <w:t>Greggs gives customers cheap food in shops that are close by and reliable (value creation, C1 in Figure 2). However, each shop still guesses how much to bake (value configuration, C2). Greggs makes money by selling lots of cheap items to lots of people (value capture, C3) (Greggs plc, 2026).</w:t>
+        <w:t>Greggs gives customers cheap food in shops that are close by and reliable (value creation, C1 in Figure 2). However, each shop still guesses how much to bake (value configuration, C2). Greggs makes money by selling lots of cheap items to lots of people (value capture, C3; Greggs plc, 2026).</w:t>
       </w:r>
     </w:p>
     <w:p>
@@ -368,7 +368,7 @@
         <w:t>Staff:</w:t>
       </w:r>
       <w:r>
-        <w:t xml:space="preserve"> shop managers may resist the new system. Some may be confused because nobody has trained them to use it, and others may be scared that a computer will replace them. The lecture calls this ground-level resistance, caused by a lack of understanding or by fear (Curchod, 2026a).</w:t>
+        <w:t xml:space="preserve"> Shop managers may resist the new system. Some may be confused because nobody has trained them to use it, and others may be scared that a computer will replace them. The lecture calls this ground-level resistance, caused by a lack of understanding or by fear (Curchod, 2026a).</w:t>
       </w:r>
     </w:p>
     <w:p>
@@ -461,7 +461,7 @@
         <w:t>Processes and routines:</w:t>
       </w:r>
       <w:r>
-        <w:t xml:space="preserve"> the small test team tries the system in a few shops, learns from it and improves it. </w:t>
+        <w:t xml:space="preserve"> The small test team tries the system in a few shops, learns from it and improves it. </w:t>
       </w:r>
       <w:r>
         <w:rPr>
@@ -470,7 +470,7 @@
         <w:t>Skills and employee development:</w:t>
       </w:r>
       <w:r>
-        <w:t xml:space="preserve"> shop managers are trained, and Greggs hires data and AI experts. </w:t>
+        <w:t xml:space="preserve"> Shop managers are trained, and Greggs hires data and AI experts. </w:t>
       </w:r>
       <w:r>
         <w:rPr>
@@ -479,7 +479,7 @@
         <w:t>Communication and transparency:</w:t>
       </w:r>
       <w:r>
-        <w:t xml:space="preserve"> because most shop staff do not sit at a computer, Greggs shares the test results through a staff app on their phones, as IKEA did.</w:t>
+        <w:t xml:space="preserve"> Because most shop staff do not sit at a computer, Greggs shares the test results through a staff app on their phones, as IKEA did.</w:t>
       </w:r>
     </w:p>
     <w:p>
@@ -493,7 +493,7 @@
         <w:t>National culture:</w:t>
       </w:r>
       <w:r>
-        <w:t xml:space="preserve"> the UK has its own digital ecosystem, and customers already use Uber Eats and Just Eat (Curchod, 2026c). Greggs should keep these partners but give people a reason, such as app-only deals and rewards, to order more through its own app.</w:t>
+        <w:t xml:space="preserve"> The UK has its own digital ecosystem, and customers already use Uber Eats and Just Eat (Curchod, 2026c). Greggs should keep these partners but give people a reason, such as app-only deals and rewards, to order more through its own app.</w:t>
       </w:r>
     </w:p>
     <w:p>

</xml_diff>

<commit_message>
Final note: academic vocabulary pass (word-level, sentences unchanged)
Co-Authored-By: Claude Opus 5.5 <noreply@anthropic.com>
Claude-Session: https://claude.ai/code/session_01Xu2Epx64Wygh8wfGcyNeKH
</commit_message>
<xml_diff>
--- a/Mid-term note - Greggs/My_Greggs_Note_FINAL.docx
+++ b/Mid-term note - Greggs/My_Greggs_Note_FINAL.docx
@@ -72,7 +72,7 @@
         <w:t>Economic:</w:t>
       </w:r>
       <w:r>
-        <w:t xml:space="preserve"> People have less money, so they buy cheaper things. This means Greggs cannot simply raise its prices to cover higher staff costs (HM Treasury, 2024), because it would lose customers. Near my university, I could also buy cheap food at McDonald's or Subway. This shows that customers can easily go somewhere else, so Greggs has to keep its prices low (Porter, 2008).</w:t>
+        <w:t xml:space="preserve"> Consumers have less disposable income, so they buy lower-priced products. This means Greggs cannot simply raise its prices to cover higher staff costs (HM Treasury, 2024), because it would lose customers. Near my university, I could also buy low-cost food at McDonald's or Subway. This shows that customers can easily go somewhere else, so Greggs has to keep its prices low (Porter, 2008).</w:t>
       </w:r>
     </w:p>
     <w:p>
@@ -86,7 +86,7 @@
         <w:t>Social:</w:t>
       </w:r>
       <w:r>
-        <w:t xml:space="preserve"> When people order through the Greggs app, Greggs keeps more of the money. When they order through delivery apps like Uber Eats, part of the money goes to the app, so Greggs loses out (Greggs plc, 2026). Greggs cannot simply leave these apps, because many customers open Uber Eats first and choose from many restaurants, so Greggs needs to be there or it loses those customers. This gives the delivery apps bargaining power over Greggs (Porter, 2008). Evening is also Greggs' fastest-growing time of day, at 9.4% of sales in 2025 (Greggs plc, 2026). Students studying late and people finishing work or late shifts want cheap food in the evening. This means shops need to bake different food at night, such as pizza instead of breakfast items, which is hard to get right by guessing.</w:t>
+        <w:t xml:space="preserve"> When customers order through the Greggs app, Greggs retains more of the revenue. When they order through delivery apps like Uber Eats, part of the revenue goes to the app, so Greggs loses margin (Greggs plc, 2026). Greggs cannot simply leave these apps, because many customers open Uber Eats first and choose from many restaurants, so Greggs needs to be there or it loses those customers. This gives the delivery apps bargaining power over Greggs (Porter, 2008). Evening is also Greggs' fastest-growing time of day, at 9.4% of sales in 2025 (Greggs plc, 2026). Students studying late and employees finishing work or late shifts want low-cost food in the evening. This means shops need to bake different food at night, such as pizza instead of breakfast items, which is difficult to predict accurately by guessing.</w:t>
       </w:r>
     </w:p>
     <w:p>
@@ -100,7 +100,7 @@
         <w:t>Environmental:</w:t>
       </w:r>
       <w:r>
-        <w:t xml:space="preserve"> Leftover food makes Greggs lose money, because that food could have been sold for a profit. Greggs already sells some leftover food cheaply through the Too Good To Go app (Grocery Gazette, 2025). This helps, but Greggs earns much less than it would by selling the food at full price. It would be better not to bake too much in the first place.</w:t>
+        <w:t xml:space="preserve"> Leftover food causes Greggs to incur losses, because that food could have been sold for a profit. Greggs already sells some leftover food at a discount through the Too Good To Go app (Grocery Gazette, 2025). This helps, but Greggs earns much less than it would by selling the food at full price. It would be better not to bake too much in the first place.</w:t>
       </w:r>
     </w:p>
     <w:p>
@@ -122,7 +122,7 @@
         <w:jc w:val="both"/>
       </w:pPr>
       <w:r>
-        <w:t>Greggs gives customers cheap food in shops that are close by and reliable (value creation, C1 in Figure 2). However, each shop still guesses how much to bake (value configuration, C2). Greggs makes money by selling lots of cheap items to lots of people (value capture, C3; Greggs plc, 2026).</w:t>
+        <w:t>Greggs offers customers low-cost food in shops that are close by and reliable (value creation, C1 in Figure 2). However, each shop still guesses how much to bake (value configuration, C2). Greggs generates revenue by selling large volumes of low-priced items to a broad customer base (value capture, C3; Greggs plc, 2026).</w:t>
       </w:r>
     </w:p>
     <w:p>
@@ -259,7 +259,7 @@
         <w:jc w:val="both"/>
       </w:pPr>
       <w:r>
-        <w:t>With this plan, customers would find their favourite items sold out less often, and they could skip the queue by ordering ahead in the app (new value creation, P1). This matters to me: once at lunchtime, the item I wanted was sold out, so I left and went to Subway, and Greggs lost that sale. However, when I asked a friend whether they had ever found their food sold out at Greggs or seen lots left at closing, they said no. This suggests the problem may be less visible to customers than to Greggs, which sees the cost of waste in its own figures. With the new plan, Greggs would throw away less food and would not pay Uber Eats a cut on orders made in its own app (new value capture, P3). This links value creation to value capture, as a strategy should (Collis, 2021).</w:t>
+        <w:t>With this plan, customers would find their favourite items sold out less often, and they could avoid queues by ordering ahead in the app (new value creation, P1). This matters to me: once at lunchtime, the item I wanted was sold out, so I left and went to Subway, and Greggs lost that sale. However, when I asked a friend whether they had ever found their food sold out at Greggs or seen lots left at closing, they said no. This suggests the problem may be less visible to customers than to Greggs, which sees the cost of waste in its own figures. With the new plan, Greggs would throw away less food and would not pay Uber Eats commission on orders made in its own app (new value capture, P3). This links value creation to value capture, as a strategy should (Collis, 2021).</w:t>
       </w:r>
     </w:p>
     <w:p>
@@ -332,7 +332,7 @@
         <w:jc w:val="both"/>
       </w:pPr>
       <w:r>
-        <w:t>Greggs has a hybrid competitive advantage: it is cheaper than rivals such as Subway, but it also has something special, like its famous sausage roll (Whittington et al., 2024). The danger is that Greggs could end up 'stuck in the middle', not the cheapest and not the most special, and lose customers to both sides (Whittington et al., 2024). My plan helps it avoid this. Less food thrown away and not paying Uber Eats a cut save Greggs money, which helps it stay cheap. Fewer sold-out items and skipping the queue by ordering ahead make customers happier, which makes Greggs more special. Rivals such as Tesco could also build an app, so the app alone is not special. What they cannot easily copy is that Greggs has its own bakeries and lorries, so it can use app data to change what is baked and delivered to each shop (Porter, 1996).</w:t>
+        <w:t>Greggs has a hybrid competitive advantage: it is lower-priced than rivals such as Subway, but it also offers something distinctive, like its famous sausage roll (Whittington et al., 2024). The danger is that Greggs could end up 'stuck in the middle', neither the lowest-priced nor the most distinctive, and lose customers to both sides (Whittington et al., 2024). My plan helps it avoid this. Less food waste and not paying Uber Eats commission reduce Greggs' costs, which helps it keep prices low. Fewer sold-out items and avoiding queues by ordering ahead increase customer satisfaction, which makes Greggs more distinctive. Rivals such as Tesco could also build an app, so the app alone is not a source of advantage. What they cannot easily copy is that Greggs has its own bakeries and distribution network, so it can use app data to change what is baked and delivered to each shop (Porter, 1996).</w:t>
       </w:r>
     </w:p>
     <w:p>
@@ -382,7 +382,7 @@
         <w:t>Leaders:</w:t>
       </w:r>
       <w:r>
-        <w:t xml:space="preserve"> Greggs' leaders may see the app as just a marketing tool for discounts, not as something that should change how the company bakes. The lecture calls this bounded rationality (Curchod, 2026a). Money is also tight: Greggs spent £287.5 million on investment in 2025 while its profit fell (Greggs plc, 2026), so leaders may prefer to wait.</w:t>
+        <w:t xml:space="preserve"> Greggs' leaders may see the app as merely a marketing tool for discounts, not as something that should change how the company bakes. The lecture calls this bounded rationality (Curchod, 2026a). Financial resources are also limited: Greggs spent £287.5 million on investment in 2025 while its profit fell (Greggs plc, 2026), so leaders may prefer to wait.</w:t>
       </w:r>
     </w:p>
     <w:p>
@@ -396,7 +396,7 @@
         <w:t>Company habits:</w:t>
       </w:r>
       <w:r>
-        <w:t xml:space="preserve"> Greggs has had record sales doing things its own way, so people may ask why it should change. This is a competency trap, as happened to Nokia (Leonard-Barton, 1992). For Greggs, the risk is real: it became successful through head-office control and the same recipes in every shop, and that same control could make it slow to let app data change how each shop bakes.</w:t>
+        <w:t xml:space="preserve"> Greggs has had record sales doing things its own way, so staff and managers may question why it should change. This is a competency trap, as happened to Nokia (Leonard-Barton, 1992). For Greggs, the risk is real: it became successful through head-office control and the same recipes in every shop, and that same control could make it slow to let app data change how each shop bakes.</w:t>
       </w:r>
     </w:p>
     <w:p>
@@ -424,7 +424,7 @@
         <w:t>Fixing staff resistance:</w:t>
       </w:r>
       <w:r>
-        <w:t xml:space="preserve"> Greggs should train shop managers to use the new system, so they are not confused. The computer should only suggest how much to bake, while the manager still makes the final decision, so staff are not scared of being replaced. This also covers a weakness in my own plan: the AI forecast may get unusual days wrong, such as a sudden storm or a football match, so shops could still run out of food. Because the manager makes the final decision, they can change the bake on those days.</w:t>
+        <w:t xml:space="preserve"> Greggs should train shop managers to use the new system, so they are not confused. The computer should only suggest how much to bake, while the manager still makes the final decision, so staff are not scared of being replaced. This also covers a weakness in my own plan: the AI forecast may be inaccurate on unusual days, such as a sudden storm or a football match, so shops could still run out of food. Because the manager makes the final decision, they can change the bake on those days.</w:t>
       </w:r>
     </w:p>
     <w:p>
@@ -438,7 +438,7 @@
         <w:t>Fixing the leaders' challenge:</w:t>
       </w:r>
       <w:r>
-        <w:t xml:space="preserve"> Greggs should set up a small separate team for this project, so the rest of the business keeps running normally. This is called ambidexterity (O'Reilly and Tushman, 2004). The team should first test the system in about 50 shops. If it works, leaders will have proof before spending more. Leaders who are worried about money are more likely to trust real results, such as less waste and more sales, than a promise. Building this habit of testing new ideas creates dynamic capabilities (Teece, 2007).</w:t>
+        <w:t xml:space="preserve"> Greggs should set up a small separate team for this project, so the rest of the business keeps running normally. This is called ambidexterity (O'Reilly and Tushman, 2004). The team should first test the system in about 50 shops. If it works, leaders will have proof before spending more. Leaders who are concerned about costs are more likely to trust real results, such as less waste and more sales, than a promise. Building this habit of testing new ideas creates dynamic capabilities (Teece, 2007).</w:t>
       </w:r>
     </w:p>
     <w:p>
@@ -493,7 +493,7 @@
         <w:t>National culture:</w:t>
       </w:r>
       <w:r>
-        <w:t xml:space="preserve"> The UK has its own digital ecosystem, and customers already use Uber Eats and Just Eat (Curchod, 2026c). Greggs should keep these partners but give people a reason, such as app-only deals and rewards, to order more through its own app.</w:t>
+        <w:t xml:space="preserve"> The UK has its own digital ecosystem, and customers already use Uber Eats and Just Eat (Curchod, 2026c). Greggs should keep these partners but give customers a reason, such as app-only deals and rewards, to order more through its own app.</w:t>
       </w:r>
     </w:p>
     <w:p>
@@ -515,7 +515,7 @@
         <w:jc w:val="both"/>
       </w:pPr>
       <w:r>
-        <w:t>Greggs should use the information from app orders to decide what each shop bakes. This would mean less food wasted, and Greggs would keep more of its money instead of paying part of it to Uber Eats. To make the change work, Greggs should test it first in a few shops, with staff trained and involved.</w:t>
+        <w:t>Greggs should use the information from app orders to decide what each shop bakes. This would mean less food wasted, and Greggs would retain more of its revenue instead of paying part of it to Uber Eats. To make the change work, Greggs should test it first in a few shops, with staff trained and involved.</w:t>
       </w:r>
     </w:p>
     <w:p>
@@ -526,7 +526,7 @@
         <w:rPr>
           <w:b/>
         </w:rPr>
-        <w:t>Word count: 1382 words (excluding headings, figures, captions and reference list)</w:t>
+        <w:t>Word count: 1391 words (excluding headings, figures, captions and reference list)</w:t>
       </w:r>
     </w:p>
     <w:p>

</xml_diff>